<commit_message>
Give the face and voice more weight than the words, and highlight the demo and report
</commit_message>
<xml_diff>
--- a/REPORT.docx
+++ b/REPORT.docx
@@ -662,7 +662,7 @@
         <w:pStyle w:val="BodyText"/>
       </w:pPr>
       <w:r>
-        <w:t xml:space="preserve">The voice detector and endpointer cut the audio into turns. When a turn ends, the audio model runs first (frozen WavLM averaged over time, then my small head), then Whisper turns the speech into words and RoBERTa reads them with the last two turns as context. Camera pictures are processed while the person is still speaking, so the face costs nothing after the turn. Late fusion averages the probabilities with weights chosen on dev, and one temperature fitted on dev makes the confidence match how often the label is right. When the views disagree, or the confidence is under 0.5, the reply prompt tells the robot what each input suggests and asks it to check in instead of assuming a feeling. The reply streams from Qwen2.5-1.5B and is spoken one sentence at a time.</w:t>
+        <w:t xml:space="preserve">The voice detector and endpointer cut the audio into turns. When a turn ends, the audio model runs first (frozen WavLM averaged over time, then my small head), then Whisper turns the speech into words and RoBERTa reads them with the last two turns as context. Camera pictures are processed while the person is still speaking, so the face costs nothing after the turn. Late fusion averages the probabilities (live: words 0.25, voice 0.30, face 0.45), and a temperature fitted on dev makes the confidence match how often the label is right. When the views disagree, or the confidence is under 0.5, the reply prompt tells the robot what each input suggests and asks it to check in instead of assuming a feeling. The reply streams from Qwen2.5-1.5B and is spoken one sentence at a time.</w:t>
       </w:r>
     </w:p>
     <w:p>
@@ -1776,13 +1776,13 @@
           <w:b/>
           <w:bCs/>
         </w:rPr>
-        <w:t xml:space="preserve">The face gets no weight on MELD.</w:t>
+        <w:t xml:space="preserve">The face counts live, by my choice.</w:t>
       </w:r>
       <w:r>
         <w:t xml:space="preserve"> </w:t>
       </w:r>
       <w:r>
-        <w:t xml:space="preserve">The dev search set its weight to 0: the largest face is often not the speaker, and MELD labels the utterance, not the expression. Live, with one person facing the camera, the face is a third view and a reason to check in.</w:t>
+        <w:t xml:space="preserve">The pure dev search gave the face weight 0 (the scored row above): on MELD the largest face is often not the speaker, and the label belongs to the sentence, not the expression. That left the words in charge even when my voice and face clearly said otherwise. So the live system uses words 0.25, voice 0.30, face 0.45: how someone sounds and looks outweighs what they say, which is how I want a companion robot to behave. I chose this split by testing it live on webcam turns. On MELD it costs accuracy: 0.599 / 0.437 on dev against 0.635 / 0.495 for the dev-best weights, because MELD's faces are TV shots where the largest face is often not the speaker. When voice and face agree against the words (150 dev turns) it follows them on 95. Its temperature is refitted on dev (0.50, calibration error 0.026). The test rows above keep the dev-best weights; this mix was not scored on test.</w:t>
       </w:r>
     </w:p>
     <w:p>
@@ -1798,13 +1798,13 @@
           <w:b/>
           <w:bCs/>
         </w:rPr>
-        <w:t xml:space="preserve">Voice and face do not override the words.</w:t>
+        <w:t xml:space="preserve">Disagreement is still flagged.</w:t>
       </w:r>
       <w:r>
         <w:t xml:space="preserve"> </w:t>
       </w:r>
       <w:r>
-        <w:t xml:space="preserve">When they agree against the words (150 dev rows), the words are right 47% of the time and the pair 31%, so following the pair would lower dev F1 from 0.635 to 0.601. Those turns are flagged and the robot checks in instead.</w:t>
+        <w:t xml:space="preserve">When the face or the voice disagrees with the words, the page names it and the robot checks in instead of assuming a feeling.</w:t>
       </w:r>
     </w:p>
     <w:p>
@@ -2491,7 +2491,7 @@
         </w:numPr>
       </w:pPr>
       <w:r>
-        <w:t xml:space="preserve">Record a small labelled webcam set, including sarcasm, to measure the live face and decide with data when voice and face should override the words.</w:t>
+        <w:t xml:space="preserve">Record a small labelled webcam set, including sarcasm, to tune the live weights on real webcam data instead of MELD.</w:t>
       </w:r>
     </w:p>
     <w:p>

</xml_diff>

<commit_message>
Add the demo video
</commit_message>
<xml_diff>
--- a/REPORT.docx
+++ b/REPORT.docx
@@ -37,6 +37,33 @@
     <w:p>
       <w:pPr>
         <w:pStyle w:val="FirstParagraph"/>
+      </w:pPr>
+      <w:r>
+        <w:rPr>
+          <w:b/>
+          <w:bCs/>
+        </w:rPr>
+        <w:t xml:space="preserve">Demo video:</w:t>
+      </w:r>
+      <w:r>
+        <w:t xml:space="preserve"> </w:t>
+      </w:r>
+      <w:r>
+        <w:rPr>
+          <w:rStyle w:val="VerbatimChar"/>
+        </w:rPr>
+        <w:t xml:space="preserve">docs/demo.mp4</w:t>
+      </w:r>
+      <w:r>
+        <w:t xml:space="preserve"> </w:t>
+      </w:r>
+      <w:r>
+        <w:t xml:space="preserve">in the repository (5.5 minutes): live mode with the webcam, the three inputs disagreeing, interrupting the robot, sample MELD clips, and one input travelling to both outputs.</w:t>
+      </w:r>
+    </w:p>
+    <w:p>
+      <w:pPr>
+        <w:pStyle w:val="BodyText"/>
       </w:pPr>
       <w:r>
         <w:t xml:space="preserve">Track: Text + Audio, plus the optional vision extension. Every number here came from a script in this repository, run on the machine in section 6. The full log of decisions and measurements, including what did not work, is in</w:t>

</xml_diff>